<commit_message>
docs: SRS notes for license conflict and request throttling
Co-Authored-By: Claude Fable 5.1 <noreply@anthropic.com>
</commit_message>
<xml_diff>
--- a/docs/Galaxy_CMMC_Portal_SRS_v1.1.docx
+++ b/docs/Galaxy_CMMC_Portal_SRS_v1.1.docx
@@ -12223,22 +12223,7 @@
         <w:t xml:space="preserve">shall</w:t>
       </w:r>
       <w:r>
-        <w:t xml:space="preserve"> be assignable at any time.</w:t>
-      </w:r>
-    </w:p>
-    <w:p>
-      <w:pPr>
-        <w:spacing w:after="140" w:line="276"/>
-      </w:pPr>
-      <w:r>
-        <w:rPr>
-          <w:b/>
-          <w:bCs/>
-        </w:rPr>
-        <w:t xml:space="preserve">FR-LC-05</w:t>
-      </w:r>
-      <w:r>
-        <w:t xml:space="preserve"> — Assigning a Single or Additional license </w:t>
+        <w:t xml:space="preserve"> be assignable at any time. The database </w:t>
       </w:r>
       <w:r>
         <w:rPr>
@@ -12248,22 +12233,7 @@
         <w:t xml:space="preserve">shall</w:t>
       </w:r>
       <w:r>
-        <w:t xml:space="preserve"> open a new cycle when the latest cycle is finalized, and reuse the latest cycle when it is unfinished.</w:t>
-      </w:r>
-    </w:p>
-    <w:p>
-      <w:pPr>
-        <w:spacing w:after="140" w:line="276"/>
-      </w:pPr>
-      <w:r>
-        <w:rPr>
-          <w:b/>
-          <w:bCs/>
-        </w:rPr>
-        <w:t xml:space="preserve">FR-LC-06</w:t>
-      </w:r>
-      <w:r>
-        <w:t xml:space="preserve"> — A client's entitlement </w:t>
+        <w:t xml:space="preserve"> allow at most one non-voided Single license per client; a concurrent second assignment </w:t>
       </w:r>
       <w:r>
         <w:rPr>
@@ -12273,42 +12243,7 @@
         <w:t xml:space="preserve">shall</w:t>
       </w:r>
       <w:r>
-        <w:t xml:space="preserve"> be derived from their latest non-voided license by start date: none, active, or expired.</w:t>
-      </w:r>
-    </w:p>
-    <w:p>
-      <w:pPr>
-        <w:spacing w:after="140" w:line="276"/>
-      </w:pPr>
-      <w:r>
-        <w:rPr>
-          <w:b/>
-          <w:bCs/>
-        </w:rPr>
-        <w:t xml:space="preserve">FR-LC-07</w:t>
-      </w:r>
-      <w:r>
-        <w:t xml:space="preserve"> — Without an active license, a client </w:t>
-      </w:r>
-      <w:r>
-        <w:rPr>
-          <w:b/>
-          <w:bCs/>
-        </w:rPr>
-        <w:t xml:space="preserve">shall not</w:t>
-      </w:r>
-      <w:r>
-        <w:t xml:space="preserve"> be able to save answers, upload or delete evidence, change the document library, save scoping, respond to information requests, or submit. The server </w:t>
-      </w:r>
-      <w:r>
-        <w:rPr>
-          <w:b/>
-          <w:bCs/>
-        </w:rPr>
-        <w:t xml:space="preserve">shall</w:t>
-      </w:r>
-      <w:r>
-        <w:t xml:space="preserve"> return 403 </w:t>
+        <w:t xml:space="preserve"> return 409 </w:t>
       </w:r>
       <w:r>
         <w:rPr>
@@ -12316,6 +12251,102 @@
           <w:sz w:val="20"/>
           <w:szCs w:val="20"/>
         </w:rPr>
+        <w:t xml:space="preserve">single_already_assigned</w:t>
+      </w:r>
+      <w:r>
+        <w:t xml:space="preserve">.</w:t>
+      </w:r>
+    </w:p>
+    <w:p>
+      <w:pPr>
+        <w:spacing w:after="140" w:line="276"/>
+      </w:pPr>
+      <w:r>
+        <w:rPr>
+          <w:b/>
+          <w:bCs/>
+        </w:rPr>
+        <w:t xml:space="preserve">FR-LC-05</w:t>
+      </w:r>
+      <w:r>
+        <w:t xml:space="preserve"> — Assigning a Single or Additional license </w:t>
+      </w:r>
+      <w:r>
+        <w:rPr>
+          <w:b/>
+          <w:bCs/>
+        </w:rPr>
+        <w:t xml:space="preserve">shall</w:t>
+      </w:r>
+      <w:r>
+        <w:t xml:space="preserve"> open a new cycle when the latest cycle is finalized, and reuse the latest cycle when it is unfinished.</w:t>
+      </w:r>
+    </w:p>
+    <w:p>
+      <w:pPr>
+        <w:spacing w:after="140" w:line="276"/>
+      </w:pPr>
+      <w:r>
+        <w:rPr>
+          <w:b/>
+          <w:bCs/>
+        </w:rPr>
+        <w:t xml:space="preserve">FR-LC-06</w:t>
+      </w:r>
+      <w:r>
+        <w:t xml:space="preserve"> — A client's entitlement </w:t>
+      </w:r>
+      <w:r>
+        <w:rPr>
+          <w:b/>
+          <w:bCs/>
+        </w:rPr>
+        <w:t xml:space="preserve">shall</w:t>
+      </w:r>
+      <w:r>
+        <w:t xml:space="preserve"> be derived from their latest non-voided license by start date: none, active, or expired.</w:t>
+      </w:r>
+    </w:p>
+    <w:p>
+      <w:pPr>
+        <w:spacing w:after="140" w:line="276"/>
+      </w:pPr>
+      <w:r>
+        <w:rPr>
+          <w:b/>
+          <w:bCs/>
+        </w:rPr>
+        <w:t xml:space="preserve">FR-LC-07</w:t>
+      </w:r>
+      <w:r>
+        <w:t xml:space="preserve"> — Without an active license, a client </w:t>
+      </w:r>
+      <w:r>
+        <w:rPr>
+          <w:b/>
+          <w:bCs/>
+        </w:rPr>
+        <w:t xml:space="preserve">shall not</w:t>
+      </w:r>
+      <w:r>
+        <w:t xml:space="preserve"> be able to save answers, upload or delete evidence, change the document library, save scoping, respond to information requests, or submit. The server </w:t>
+      </w:r>
+      <w:r>
+        <w:rPr>
+          <w:b/>
+          <w:bCs/>
+        </w:rPr>
+        <w:t xml:space="preserve">shall</w:t>
+      </w:r>
+      <w:r>
+        <w:t xml:space="preserve"> return 403 </w:t>
+      </w:r>
+      <w:r>
+        <w:rPr>
+          <w:rFonts w:ascii="Consolas" w:cs="Consolas" w:eastAsia="Consolas" w:hAnsi="Consolas"/>
+          <w:sz w:val="20"/>
+          <w:szCs w:val="20"/>
+        </w:rPr>
         <w:t xml:space="preserve">license_inactive</w:t>
       </w:r>
       <w:r>
@@ -12474,7 +12505,38 @@
         <w:t xml:space="preserve">shall</w:t>
       </w:r>
       <w:r>
-        <w:t xml:space="preserve"> be able to request a package, which emails the admin.</w:t>
+        <w:t xml:space="preserve"> be able to request a package, which emails the admin. Requests </w:t>
+      </w:r>
+      <w:r>
+        <w:rPr>
+          <w:b/>
+          <w:bCs/>
+        </w:rPr>
+        <w:t xml:space="preserve">shall</w:t>
+      </w:r>
+      <w:r>
+        <w:t xml:space="preserve"> be limited to one per client per hour; a repeat within the hour </w:t>
+      </w:r>
+      <w:r>
+        <w:rPr>
+          <w:b/>
+          <w:bCs/>
+        </w:rPr>
+        <w:t xml:space="preserve">shall</w:t>
+      </w:r>
+      <w:r>
+        <w:t xml:space="preserve"> return 429 </w:t>
+      </w:r>
+      <w:r>
+        <w:rPr>
+          <w:rFonts w:ascii="Consolas" w:cs="Consolas" w:eastAsia="Consolas" w:hAnsi="Consolas"/>
+          <w:sz w:val="20"/>
+          <w:szCs w:val="20"/>
+        </w:rPr>
+        <w:t xml:space="preserve">too_many_requests</w:t>
+      </w:r>
+      <w:r>
+        <w:t xml:space="preserve">.</w:t>
       </w:r>
     </w:p>
     <w:p>
@@ -17786,7 +17848,7 @@
                 <w:sz w:val="19"/>
                 <w:szCs w:val="19"/>
               </w:rPr>
-              <w:t xml:space="preserve">Client licensing and packages (FR-LC-01–13, §10.4): package catalog, append-only license ledger, entitlement-gated client writes, admin assignment and voiding, client-started Unlimited cycles, 14-day expiry reminders. Answer save now checks ownership and status (FR-CL-09). Route tests for the client write paths (VER-01).</w:t>
+              <w:t xml:space="preserve">Client licensing and packages (FR-LC-01–13, §10.4): package catalog, append-only license ledger, entitlement-gated client writes, admin assignment and voiding, client-started Unlimited cycles, 14-day expiry reminders. Answer save now checks ownership and status (FR-CL-09). Route tests for the client write paths (VER-01). Database-enforced single Single license (409) and one package request per hour (429).</w:t>
             </w:r>
           </w:p>
         </w:tc>

</xml_diff>